<commit_message>
Consolidate supporting figures and combine tables in one Excel workbook
</commit_message>
<xml_diff>
--- a/manuscript/annals/concise-report/manuscript.docx
+++ b/manuscript/annals/concise-report/manuscript.docx
@@ -135,7 +135,7 @@
         <w:t>Graphical abstract summary:</w:t>
       </w:r>
       <w:r>
-        <w:t xml:space="preserve"> PhytoScope connects user-supplied plant annotations, matching sequences, and expression matrices in a local locus workspace. Cross-species structural audits, independent sequence gold standards, and public expression identifier reconciliation test the same reusable workflow. </w:t>
+        <w:t xml:space="preserve"> PhytoScope connects user-supplied plant annotations, matching sequences, and expression matrices in a local locus workspace. Cross-species structural audits, independent sequence gold standards, and public expression identifier reconciliation test the same reusable workflow.</w:t>
       </w:r>
     </w:p>
     <w:p>
@@ -281,12 +281,12 @@
     </w:p>
     <w:p>
       <w:r>
-        <w:t>The evaluated annotations from all seven taxa were imported and queried without changing the parser or adding species-specific query branches. Complete GFF3 imports in the three additional plants supported sequence recognition, identifier search, and selected transcript-structure views, including loci on unplaced scaffolds (Figure 1A–C; Figure S1). Thus, a change of species was expressed through data files rather than a new application implementation.</w:t>
+        <w:t>The evaluated annotations from all seven taxa were imported and queried without changing the parser or adding species-specific query branches. Complete GFF3 imports in the three additional plants supported sequence recognition, identifier search, and selected transcript-structure views, including loci on unplaced scaffolds (Figure 1A–C; Figure S1A). Thus, a change of species was expressed through data files rather than a new application implementation.</w:t>
       </w:r>
     </w:p>
     <w:p>
       <w:r>
-        <w:t>Across the eight source inventories, all 4,641,758 recognized structural tuples matched exactly, with zero missing or extra tuples (Figure 1D; Table S2; Figure S2). These are feature/relationship records, not a count of distinct genes. The four-species gffutils comparison likewise reproduced the source-derived tuples in every archived trial. Timings describe different setup operations—application import and SQLite index construction—and were retained as execution records rather than a speed comparison.</w:t>
+        <w:t>Across the eight source inventories, all 4,641,758 recognized structural tuples matched exactly, with zero missing or extra tuples (Figure 1D; Table S2; Figure S1B). These are feature/relationship records, not a count of distinct genes. The four-species gffutils comparison likewise reproduced the source-derived tuples in every archived trial. Timings describe different setup operations—application import and SQLite index construction—and were retained as execution records rather than a speed comparison.</w:t>
       </w:r>
     </w:p>
     <w:p>
@@ -296,12 +296,12 @@
     </w:p>
     <w:p>
       <w:r>
-        <w:t>The re-quantified expression matrix contained 34,914 gene-level target identifiers and three sample columns. All identifiers matched the pinned annotation, with zero unmatched identifiers, missing cells, or invalid cells; each TPM column summed to one million within rounding (Figure 1D; Table S3; Figure S3). Figure 1C shows individual replicate TPM values for LOC148191553 as an expression-display example, separate from the sequence example. The result establishes release-specific identifier reconciliation of public reads, not biological equivalence between the source genotype and reference cultivar.</w:t>
+        <w:t>The re-quantified expression matrix contained 34,914 gene-level target identifiers and three sample columns. All identifiers matched the pinned annotation, with zero unmatched identifiers, missing cells, or invalid cells; each TPM column summed to one million within rounding (Figure 1D; Table S3; Figure S1C). Figure 1C shows individual replicate TPM values for LOC148191553 as an expression-display example, separate from the sequence example. The result establishes release-specific identifier reconciliation of public reads, not biological equivalence between the source genotype and reference cultivar.</w:t>
       </w:r>
     </w:p>
     <w:p>
       <w:r>
-        <w:t>Supporting module checks recovered eight of eight promoter sequences exactly, 16 domain-coordinate records across 13 genes, and agreement in the small protein-classification panel. Expression-grouping arithmetic and project restoration were also checked through their separate regressions (Table S4; Figure S4). These task-specific checks extend the locus workflow while keeping each result tied to its own reference and denominator.</w:t>
+        <w:t>Supporting module checks recovered eight of eight promoter sequences exactly, 16 domain-coordinate records across 13 genes, and agreement in the small protein-classification panel. Expression-grouping arithmetic and project restoration were also checked through their separate regressions (Table S4; Figure S1D). These task-specific checks extend the locus workflow while keeping each result tied to its own reference and denominator.</w:t>
       </w:r>
     </w:p>
     <w:p>

</xml_diff>